<commit_message>
Auto sync: 2026-06-29 05:07
</commit_message>
<xml_diff>
--- a/機率與統計小抄.docx
+++ b/機率與統計小抄.docx
@@ -1,6 +1,6 @@
 
 <file path=word/document.xml><?xml version="1.0" encoding="utf-8"?>
-<w:document xmlns:wpc="http://schemas.microsoft.com/office/word/2010/wordprocessingCanvas" xmlns:mo="http://schemas.microsoft.com/office/mac/office/2008/main" xmlns:mc="http://schemas.openxmlformats.org/markup-compatibility/2006" xmlns:mv="urn:schemas-microsoft-com:mac:vml" xmlns:o="urn:schemas-microsoft-com:office:office" xmlns:r="http://schemas.openxmlformats.org/officeDocument/2006/relationships" xmlns:m="http://schemas.openxmlformats.org/officeDocument/2006/math" xmlns:v="urn:schemas-microsoft-com:vml" xmlns:wp14="http://schemas.microsoft.com/office/word/2010/wordprocessingDrawing" xmlns:wp="http://schemas.openxmlformats.org/drawingml/2006/wordprocessingDrawing" xmlns:w10="urn:schemas-microsoft-com:office:word" xmlns:w="http://schemas.openxmlformats.org/wordprocessingml/2006/main" xmlns:w14="http://schemas.microsoft.com/office/word/2010/wordml" xmlns:wpg="http://schemas.microsoft.com/office/word/2010/wordprocessingGroup" xmlns:wpi="http://schemas.microsoft.com/office/word/2010/wordprocessingInk" xmlns:wne="http://schemas.microsoft.com/office/word/2006/wordml" xmlns:wps="http://schemas.microsoft.com/office/word/2010/wordprocessingShape" mc:Ignorable="w14 wp14">
+<w:document xmlns:wpc="http://schemas.microsoft.com/office/word/2010/wordprocessingCanvas" xmlns:mc="http://schemas.openxmlformats.org/markup-compatibility/2006" xmlns:o="urn:schemas-microsoft-com:office:office" xmlns:r="http://schemas.openxmlformats.org/officeDocument/2006/relationships" xmlns:m="http://schemas.openxmlformats.org/officeDocument/2006/math" xmlns:v="urn:schemas-microsoft-com:vml" xmlns:wp14="http://schemas.microsoft.com/office/word/2010/wordprocessingDrawing" xmlns:wp="http://schemas.openxmlformats.org/drawingml/2006/wordprocessingDrawing" xmlns:w10="urn:schemas-microsoft-com:office:word" xmlns:w="http://schemas.openxmlformats.org/wordprocessingml/2006/main" xmlns:w14="http://schemas.microsoft.com/office/word/2010/wordml" xmlns:w15="http://schemas.microsoft.com/office/word/2012/wordml" xmlns:w16se="http://schemas.microsoft.com/office/word/2015/wordml/symex" xmlns:w16cid="http://schemas.microsoft.com/office/word/2016/wordml/cid" xmlns:w16="http://schemas.microsoft.com/office/word/2018/wordml" xmlns:w16cex="http://schemas.microsoft.com/office/word/2018/wordml/cex" xmlns:w16sdtdh="http://schemas.microsoft.com/office/word/2020/wordml/sdtdatahash" xmlns:wne="http://schemas.microsoft.com/office/word/2006/wordml" xmlns:wpg="http://schemas.microsoft.com/office/word/2010/wordprocessingGroup" xmlns:wps="http://schemas.microsoft.com/office/word/2010/wordprocessingShape" mc:Ignorable="w14 w15 w16se w16cid w16 w16cex w16sdtdh wp14">
   <w:body>
     <w:p>
       <w:pPr>
@@ -8,6 +8,14 @@
         <w:jc w:val="center"/>
       </w:pPr>
       <w:r>
+        <w:rPr>
+          <w:rFonts w:ascii="Calibri" w:hAnsi="Calibri" w:eastAsia="ＭＳ ゴシック" w:cs="Calibri" w:asciiTheme="majorHAnsi" w:hAnsiTheme="majorHAnsi" w:eastAsiaTheme="majorEastAsia" w:csTheme="majorBidi"/>
+          <w:color w:val="17365D" w:themeColor="text2" w:themeShade="BF"/>
+          <w:spacing w:val="5"/>
+          <w:kern w:val="28"/>
+          <w:sz w:val="52"/>
+          <w:szCs w:val="52"/>
+        </w:rPr>
         <w:t>機率與統計 考前必備小抄 (Ch2, 3.1-3.2, 4.1-4.7)</w:t>
       </w:r>
     </w:p>
@@ -17,7 +25,12 @@
       </w:pPr>
       <w:r>
         <w:rPr>
+          <w:rFonts w:ascii="Calibri" w:hAnsi="Calibri" w:eastAsia="ＭＳ ゴシック" w:cs="Calibri" w:asciiTheme="majorHAnsi" w:hAnsiTheme="majorHAnsi" w:eastAsiaTheme="majorEastAsia" w:csTheme="majorBidi"/>
+          <w:b/>
+          <w:bCs/>
           <w:color w:val="003366"/>
+          <w:sz w:val="28"/>
+          <w:szCs w:val="28"/>
         </w:rPr>
         <w:t>Ch 2 機率與貝氏定理 (Probability &amp; Bayes' Theorem)</w:t>
       </w:r>
@@ -25,64 +38,118 @@
     <w:p>
       <w:pPr>
         <w:pStyle w:val="ListBullet"/>
+        <w:ind w:left="360" w:hanging="360"/>
       </w:pPr>
       <w:r>
+        <w:rPr>
+          <w:rFonts w:ascii="Cambria" w:hAnsi="Cambria" w:eastAsia="ＭＳ 明朝" w:cs="Cambria" w:asciiTheme="minorHAnsi" w:hAnsiTheme="minorHAnsi" w:eastAsiaTheme="minorEastAsia" w:csTheme="minorBidi"/>
+          <w:sz w:val="22"/>
+          <w:szCs w:val="22"/>
+        </w:rPr>
         <w:t>聯集機率 (Union): P(A ∪ B) = P(A) + P(B) - P(A ∩ B)</w:t>
       </w:r>
     </w:p>
     <w:p>
       <w:pPr>
         <w:pStyle w:val="ListBullet"/>
+        <w:ind w:left="360" w:hanging="360"/>
       </w:pPr>
       <w:r>
+        <w:rPr>
+          <w:rFonts w:ascii="Cambria" w:hAnsi="Cambria" w:eastAsia="ＭＳ 明朝" w:cs="Cambria" w:asciiTheme="minorHAnsi" w:hAnsiTheme="minorHAnsi" w:eastAsiaTheme="minorEastAsia" w:csTheme="minorBidi"/>
+          <w:sz w:val="22"/>
+          <w:szCs w:val="22"/>
+        </w:rPr>
         <w:t>條件機率 (Conditional Prob): P(A | B) = P(A ∩ B) / P(B)</w:t>
       </w:r>
     </w:p>
     <w:p>
       <w:pPr>
         <w:pStyle w:val="ListBullet"/>
+        <w:ind w:left="360" w:hanging="360"/>
       </w:pPr>
       <w:r>
-        <w:t>獨立事件 (Independent): P(A ∩ B) = P(A)P(B)  (💡注意：獨立與「互斥」不同，互斥是P(A ∩ B) = 0)</w:t>
+        <w:rPr>
+          <w:rFonts w:ascii="Cambria" w:hAnsi="Cambria" w:eastAsia="ＭＳ 明朝" w:cs="Cambria" w:asciiTheme="minorHAnsi" w:hAnsiTheme="minorHAnsi" w:eastAsiaTheme="minorEastAsia" w:csTheme="minorBidi"/>
+          <w:sz w:val="22"/>
+          <w:szCs w:val="22"/>
+        </w:rPr>
+        <w:t xml:space="preserve">獨立事件 (Independent): P(A ∩ B) = P(A)P(B)  (💡注意：獨立與「互斥」不同，互斥是P(A ∩ B) = 0)</w:t>
       </w:r>
     </w:p>
     <w:p>
       <w:pPr>
         <w:pStyle w:val="ListBullet"/>
+        <w:ind w:left="360" w:hanging="360"/>
       </w:pPr>
       <w:r>
+        <w:rPr>
+          <w:rFonts w:ascii="Cambria" w:hAnsi="Cambria" w:eastAsia="ＭＳ 明朝" w:cs="Cambria" w:asciiTheme="minorHAnsi" w:hAnsiTheme="minorHAnsi" w:eastAsiaTheme="minorEastAsia" w:csTheme="minorBidi"/>
+          <w:sz w:val="22"/>
+          <w:szCs w:val="22"/>
+        </w:rPr>
         <w:t>全機率定理 (Law of Total Prob): P(B) = Σ P(B | A_i) P(A_i)</w:t>
       </w:r>
     </w:p>
     <w:p>
       <w:pPr>
         <w:pStyle w:val="ListBullet"/>
+        <w:ind w:left="360" w:hanging="360"/>
       </w:pPr>
       <w:r>
+        <w:rPr>
+          <w:rFonts w:ascii="Cambria" w:hAnsi="Cambria" w:eastAsia="ＭＳ 明朝" w:cs="Cambria" w:asciiTheme="minorHAnsi" w:hAnsiTheme="minorHAnsi" w:eastAsiaTheme="minorEastAsia" w:csTheme="minorBidi"/>
+          <w:sz w:val="22"/>
+          <w:szCs w:val="22"/>
+        </w:rPr>
         <w:t>貝氏定理 (Bayes' Theorem): P(A_i | B) = [P(B | A_i) P(A_i)] / P(B)</w:t>
       </w:r>
     </w:p>
     <w:p>
+      <w:pPr>
+        <w:spacing w:after="200" w:line="276" w:lineRule="auto"/>
+      </w:pPr>
       <w:r>
         <w:rPr>
+          <w:rFonts w:ascii="Cambria" w:hAnsi="Cambria" w:eastAsia="ＭＳ 明朝" w:cs="Cambria" w:asciiTheme="minorHAnsi" w:hAnsiTheme="minorHAnsi" w:eastAsiaTheme="minorEastAsia" w:csTheme="minorBidi"/>
           <w:b/>
+          <w:bCs/>
           <w:color w:val="CC0000"/>
+          <w:sz w:val="22"/>
+          <w:szCs w:val="22"/>
         </w:rPr>
         <w:t>⚠️ 弱點提示 (隨時補充)：</w:t>
       </w:r>
       <w:r>
+        <w:rPr>
+          <w:rFonts w:ascii="Cambria" w:hAnsi="Cambria" w:eastAsia="ＭＳ 明朝" w:cs="Cambria" w:asciiTheme="minorHAnsi" w:hAnsiTheme="minorHAnsi" w:eastAsiaTheme="minorEastAsia" w:csTheme="minorBidi"/>
+          <w:sz w:val="22"/>
+          <w:szCs w:val="22"/>
+        </w:rPr>
         <w:t xml:space="preserve"> 遇到「抽菸與疾病」、「瑕疵品分類」等歷屆題型，立刻畫樹狀圖(Tree Diagram)！先將分支機率標上去。</w:t>
       </w:r>
     </w:p>
     <w:p>
+      <w:pPr>
+        <w:spacing w:after="200" w:line="276" w:lineRule="auto"/>
+      </w:pPr>
       <w:r>
         <w:rPr>
+          <w:rFonts w:ascii="Cambria" w:hAnsi="Cambria" w:eastAsia="ＭＳ 明朝" w:cs="Cambria" w:asciiTheme="minorHAnsi" w:hAnsiTheme="minorHAnsi" w:eastAsiaTheme="minorEastAsia" w:csTheme="minorBidi"/>
           <w:b/>
+          <w:bCs/>
           <w:color w:val="CC0000"/>
+          <w:sz w:val="22"/>
+          <w:szCs w:val="22"/>
         </w:rPr>
         <w:t>⚠️ 弱點提示 (隨時補充)：</w:t>
       </w:r>
       <w:r>
+        <w:rPr>
+          <w:rFonts w:ascii="Cambria" w:hAnsi="Cambria" w:eastAsia="ＭＳ 明朝" w:cs="Cambria" w:asciiTheme="minorHAnsi" w:hAnsiTheme="minorHAnsi" w:eastAsiaTheme="minorEastAsia" w:csTheme="minorBidi"/>
+          <w:sz w:val="22"/>
+          <w:szCs w:val="22"/>
+        </w:rPr>
         <w:t xml:space="preserve"> 注意「抽出不放回(Without Replacement)」的情況，分母與分子會隨每次抽取遞減。</w:t>
       </w:r>
     </w:p>
@@ -92,7 +159,12 @@
       </w:pPr>
       <w:r>
         <w:rPr>
+          <w:rFonts w:ascii="Calibri" w:hAnsi="Calibri" w:eastAsia="ＭＳ ゴシック" w:cs="Calibri" w:asciiTheme="majorHAnsi" w:hAnsiTheme="majorHAnsi" w:eastAsiaTheme="majorEastAsia" w:csTheme="majorBidi"/>
+          <w:b/>
+          <w:bCs/>
           <w:color w:val="003366"/>
+          <w:sz w:val="28"/>
+          <w:szCs w:val="28"/>
         </w:rPr>
         <w:t>Ch 3.1 - 3.2 離散型隨機變數 (Discrete Random Variables)</w:t>
       </w:r>
@@ -100,52 +172,94 @@
     <w:p>
       <w:pPr>
         <w:pStyle w:val="ListBullet"/>
+        <w:ind w:left="360" w:hanging="360"/>
       </w:pPr>
       <w:r>
+        <w:rPr>
+          <w:rFonts w:ascii="Cambria" w:hAnsi="Cambria" w:eastAsia="ＭＳ 明朝" w:cs="Cambria" w:asciiTheme="minorHAnsi" w:hAnsiTheme="minorHAnsi" w:eastAsiaTheme="minorEastAsia" w:csTheme="minorBidi"/>
+          <w:sz w:val="22"/>
+          <w:szCs w:val="22"/>
+        </w:rPr>
         <w:t>機率質量函數 (PMF): P_X(x) = P(X = x)</w:t>
       </w:r>
     </w:p>
     <w:p>
       <w:pPr>
         <w:pStyle w:val="ListBullet"/>
+        <w:ind w:left="360" w:hanging="360"/>
       </w:pPr>
       <w:r>
+        <w:rPr>
+          <w:rFonts w:ascii="Cambria" w:hAnsi="Cambria" w:eastAsia="ＭＳ 明朝" w:cs="Cambria" w:asciiTheme="minorHAnsi" w:hAnsiTheme="minorHAnsi" w:eastAsiaTheme="minorEastAsia" w:csTheme="minorBidi"/>
+          <w:sz w:val="22"/>
+          <w:szCs w:val="22"/>
+        </w:rPr>
         <w:t>期望值 (Expected Value): E[X] = Σ x * P_X(x)</w:t>
       </w:r>
     </w:p>
     <w:p>
       <w:pPr>
         <w:pStyle w:val="ListBullet"/>
+        <w:ind w:left="360" w:hanging="360"/>
       </w:pPr>
       <w:r>
+        <w:rPr>
+          <w:rFonts w:ascii="Cambria" w:hAnsi="Cambria" w:eastAsia="ＭＳ 明朝" w:cs="Cambria" w:asciiTheme="minorHAnsi" w:hAnsiTheme="minorHAnsi" w:eastAsiaTheme="minorEastAsia" w:csTheme="minorBidi"/>
+          <w:sz w:val="22"/>
+          <w:szCs w:val="22"/>
+        </w:rPr>
         <w:t>函數期望值: E[g(X)] = Σ g(x) * P_X(x)</w:t>
       </w:r>
     </w:p>
     <w:p>
       <w:pPr>
         <w:pStyle w:val="ListBullet"/>
+        <w:ind w:left="360" w:hanging="360"/>
       </w:pPr>
       <w:r>
+        <w:rPr>
+          <w:rFonts w:ascii="Cambria" w:hAnsi="Cambria" w:eastAsia="ＭＳ 明朝" w:cs="Cambria" w:asciiTheme="minorHAnsi" w:hAnsiTheme="minorHAnsi" w:eastAsiaTheme="minorEastAsia" w:csTheme="minorBidi"/>
+          <w:sz w:val="22"/>
+          <w:szCs w:val="22"/>
+        </w:rPr>
         <w:t>變異數 (Variance): Var(X) = E[(X - μ)²] = E[X²] - (E[X])²</w:t>
       </w:r>
     </w:p>
     <w:p>
       <w:pPr>
         <w:pStyle w:val="ListBullet"/>
+        <w:ind w:left="360" w:hanging="360"/>
       </w:pPr>
       <w:r>
+        <w:rPr>
+          <w:rFonts w:ascii="Cambria" w:hAnsi="Cambria" w:eastAsia="ＭＳ 明朝" w:cs="Cambria" w:asciiTheme="minorHAnsi" w:hAnsiTheme="minorHAnsi" w:eastAsiaTheme="minorEastAsia" w:csTheme="minorBidi"/>
+          <w:sz w:val="22"/>
+          <w:szCs w:val="22"/>
+        </w:rPr>
         <w:t>標準差 (Standard Deviation): σ = √Var(X)</w:t>
       </w:r>
     </w:p>
     <w:p>
+      <w:pPr>
+        <w:spacing w:after="200" w:line="276" w:lineRule="auto"/>
+      </w:pPr>
       <w:r>
         <w:rPr>
+          <w:rFonts w:ascii="Cambria" w:hAnsi="Cambria" w:eastAsia="ＭＳ 明朝" w:cs="Cambria" w:asciiTheme="minorHAnsi" w:hAnsiTheme="minorHAnsi" w:eastAsiaTheme="minorEastAsia" w:csTheme="minorBidi"/>
           <w:b/>
+          <w:bCs/>
           <w:color w:val="CC0000"/>
+          <w:sz w:val="22"/>
+          <w:szCs w:val="22"/>
         </w:rPr>
         <w:t>⚠️ 弱點提示 (隨時補充)：</w:t>
       </w:r>
       <w:r>
+        <w:rPr>
+          <w:rFonts w:ascii="Cambria" w:hAnsi="Cambria" w:eastAsia="ＭＳ 明朝" w:cs="Cambria" w:asciiTheme="minorHAnsi" w:hAnsiTheme="minorHAnsi" w:eastAsiaTheme="minorEastAsia" w:csTheme="minorBidi"/>
+          <w:sz w:val="22"/>
+          <w:szCs w:val="22"/>
+        </w:rPr>
         <w:t xml:space="preserve"> 若題目要求計算 Var(X²)，公式為 Var(X²) = E[X⁴] - (E[X²])²，要算出每個x的四次方。這在歷屆題有出過，不要跟 E[X²] 搞混。</w:t>
       </w:r>
     </w:p>
@@ -155,7 +269,12 @@
       </w:pPr>
       <w:r>
         <w:rPr>
+          <w:rFonts w:ascii="Calibri" w:hAnsi="Calibri" w:eastAsia="ＭＳ ゴシック" w:cs="Calibri" w:asciiTheme="majorHAnsi" w:hAnsiTheme="majorHAnsi" w:eastAsiaTheme="majorEastAsia" w:csTheme="majorBidi"/>
+          <w:b/>
+          <w:bCs/>
           <w:color w:val="003366"/>
+          <w:sz w:val="28"/>
+          <w:szCs w:val="28"/>
         </w:rPr>
         <w:t>Ch 4.1 - 4.7 連續型隨機變數 (Continuous Random Variables)</w:t>
       </w:r>
@@ -163,54 +282,105 @@
     <w:p>
       <w:pPr>
         <w:pStyle w:val="ListBullet"/>
+        <w:ind w:left="360" w:hanging="360"/>
       </w:pPr>
       <w:r>
+        <w:rPr>
+          <w:rFonts w:ascii="Cambria" w:hAnsi="Cambria" w:eastAsia="ＭＳ 明朝" w:cs="Cambria" w:asciiTheme="minorHAnsi" w:hAnsiTheme="minorHAnsi" w:eastAsiaTheme="minorEastAsia" w:csTheme="minorBidi"/>
+          <w:sz w:val="22"/>
+          <w:szCs w:val="22"/>
+        </w:rPr>
         <w:t>機率密度函數 (PDF) 性質: ∫ f(x) dx = 1 (在所有可能區間積分為1)</w:t>
       </w:r>
     </w:p>
     <w:p>
       <w:pPr>
         <w:pStyle w:val="ListBullet"/>
+        <w:ind w:left="360" w:hanging="360"/>
       </w:pPr>
       <w:r>
+        <w:rPr>
+          <w:rFonts w:ascii="Cambria" w:hAnsi="Cambria" w:eastAsia="ＭＳ 明朝" w:cs="Cambria" w:asciiTheme="minorHAnsi" w:hAnsiTheme="minorHAnsi" w:eastAsiaTheme="minorEastAsia" w:csTheme="minorBidi"/>
+          <w:sz w:val="22"/>
+          <w:szCs w:val="22"/>
+        </w:rPr>
         <w:t>累積分布函數 (CDF): F(x) = P(X ≤ x) = ∫_(-∞)^x f(t) dt</w:t>
       </w:r>
     </w:p>
     <w:p>
       <w:pPr>
         <w:pStyle w:val="ListBullet"/>
+        <w:ind w:left="360" w:hanging="360"/>
       </w:pPr>
       <w:r>
+        <w:rPr>
+          <w:rFonts w:ascii="Cambria" w:hAnsi="Cambria" w:eastAsia="ＭＳ 明朝" w:cs="Cambria" w:asciiTheme="minorHAnsi" w:hAnsiTheme="minorHAnsi" w:eastAsiaTheme="minorEastAsia" w:csTheme="minorBidi"/>
+          <w:sz w:val="22"/>
+          <w:szCs w:val="22"/>
+        </w:rPr>
         <w:t>期望值 (Expected Value): E[X] = ∫ x * f(x) dx</w:t>
       </w:r>
     </w:p>
     <w:p>
       <w:pPr>
         <w:pStyle w:val="ListBullet"/>
+        <w:ind w:left="360" w:hanging="360"/>
       </w:pPr>
       <w:r>
+        <w:rPr>
+          <w:rFonts w:ascii="Cambria" w:hAnsi="Cambria" w:eastAsia="ＭＳ 明朝" w:cs="Cambria" w:asciiTheme="minorHAnsi" w:hAnsiTheme="minorHAnsi" w:eastAsiaTheme="minorEastAsia" w:csTheme="minorBidi"/>
+          <w:sz w:val="22"/>
+          <w:szCs w:val="22"/>
+        </w:rPr>
         <w:t>變異數 (Variance): Var(X) = E[X²] - (E[X])² = ∫ x² * f(x) dx - μ²</w:t>
       </w:r>
     </w:p>
     <w:p>
       <w:pPr>
         <w:pStyle w:val="ListBullet"/>
+        <w:ind w:left="360" w:hanging="360"/>
       </w:pPr>
       <w:r>
+        <w:rPr>
+          <w:rFonts w:ascii="Cambria" w:hAnsi="Cambria" w:eastAsia="ＭＳ 明朝" w:cs="Cambria" w:asciiTheme="minorHAnsi" w:hAnsiTheme="minorHAnsi" w:eastAsiaTheme="minorEastAsia" w:csTheme="minorBidi"/>
+          <w:sz w:val="22"/>
+          <w:szCs w:val="22"/>
+        </w:rPr>
         <w:t>均勻分配 (Uniform Distribution): f(x) = 1/(b-a), 期望值 (a+b)/2, 變異數 (b-a)²/12</w:t>
       </w:r>
     </w:p>
     <w:p>
+      <w:pPr>
+        <w:spacing w:after="200" w:line="276" w:lineRule="auto"/>
+      </w:pPr>
       <w:r>
         <w:rPr>
+          <w:rFonts w:ascii="Cambria" w:hAnsi="Cambria" w:eastAsia="ＭＳ 明朝" w:cs="Cambria" w:asciiTheme="minorHAnsi" w:hAnsiTheme="minorHAnsi" w:eastAsiaTheme="minorEastAsia" w:csTheme="minorBidi"/>
           <w:b/>
+          <w:bCs/>
           <w:color w:val="CC0000"/>
+          <w:sz w:val="22"/>
+          <w:szCs w:val="22"/>
         </w:rPr>
         <w:t>⚠️ 弱點提示 (隨時補充)：</w:t>
       </w:r>
       <w:r>
+        <w:rPr>
+          <w:rFonts w:ascii="Cambria" w:hAnsi="Cambria" w:eastAsia="ＭＳ 明朝" w:cs="Cambria" w:asciiTheme="minorHAnsi" w:hAnsiTheme="minorHAnsi" w:eastAsiaTheme="minorEastAsia" w:csTheme="minorBidi"/>
+          <w:sz w:val="22"/>
+          <w:szCs w:val="22"/>
+        </w:rPr>
         <w:t xml:space="preserve"> 條件期望值 E[X | X ≤ a] 的陷阱：計算時必須要「除以 P(X ≤ a)」。</w:t>
-        <w:br/>
+      </w:r>
+      <w:r>
+        <w:br w:type="textWrapping"/>
+      </w:r>
+      <w:r>
+        <w:rPr>
+          <w:rFonts w:ascii="Cambria" w:hAnsi="Cambria" w:eastAsia="ＭＳ 明朝" w:cs="Cambria" w:asciiTheme="minorHAnsi" w:hAnsiTheme="minorHAnsi" w:eastAsiaTheme="minorEastAsia" w:csTheme="minorBidi"/>
+          <w:sz w:val="22"/>
+          <w:szCs w:val="22"/>
+        </w:rPr>
         <w:t>公式: E[X | X ≤ a] = ( ∫_(-∞)^a x*f(x) dx ) / P(X ≤ a)。歷屆題常考給定條件下的期望值！</w:t>
       </w:r>
     </w:p>
@@ -220,59 +390,291 @@
       </w:pPr>
       <w:r>
         <w:rPr>
+          <w:rFonts w:ascii="Calibri" w:hAnsi="Calibri" w:eastAsia="ＭＳ ゴシック" w:cs="Calibri" w:asciiTheme="majorHAnsi" w:hAnsiTheme="majorHAnsi" w:eastAsiaTheme="majorEastAsia" w:csTheme="majorBidi"/>
+          <w:b/>
+          <w:bCs/>
           <w:color w:val="003366"/>
+          <w:sz w:val="28"/>
+          <w:szCs w:val="28"/>
         </w:rPr>
-        <w:t>聯合機率分配 (Joint Probability) 與其他重點 (補充教材/歷屆)</w:t>
+        <w:t>Ch 06 聯合機率分配 (Joint Probability)</w:t>
       </w:r>
     </w:p>
     <w:p>
       <w:pPr>
         <w:pStyle w:val="ListBullet"/>
+        <w:ind w:left="360" w:hanging="360"/>
       </w:pPr>
       <w:r>
+        <w:rPr>
+          <w:rFonts w:ascii="Cambria" w:hAnsi="Cambria" w:eastAsia="ＭＳ 明朝" w:cs="Cambria" w:asciiTheme="minorHAnsi" w:hAnsiTheme="minorHAnsi" w:eastAsiaTheme="minorEastAsia" w:csTheme="minorBidi"/>
+          <w:sz w:val="22"/>
+          <w:szCs w:val="22"/>
+        </w:rPr>
         <w:t>聯合 PMF: P_{X,Y}(x, y)</w:t>
       </w:r>
     </w:p>
     <w:p>
       <w:pPr>
         <w:pStyle w:val="ListBullet"/>
+        <w:ind w:left="360" w:hanging="360"/>
       </w:pPr>
       <w:r>
-        <w:t>邊際分配 (Marginal Prob): P_X(x) = Σ_y P_{X,Y}(x, y)</w:t>
+        <w:rPr>
+          <w:rFonts w:ascii="Cambria" w:hAnsi="Cambria" w:eastAsia="ＭＳ 明朝" w:cs="Cambria" w:asciiTheme="minorHAnsi" w:hAnsiTheme="minorHAnsi" w:eastAsiaTheme="minorEastAsia" w:csTheme="minorBidi"/>
+          <w:sz w:val="22"/>
+          <w:szCs w:val="22"/>
+        </w:rPr>
+        <w:t>邊際機率 (Marginal Prob): 從表格中把「同一列(Row)」或「同一欄(Column)」全部加起來。即 P_X(x) = Σ_y P_{X,Y}(x, y)</w:t>
       </w:r>
     </w:p>
     <w:p>
       <w:pPr>
         <w:pStyle w:val="ListBullet"/>
+        <w:ind w:left="360" w:hanging="360"/>
       </w:pPr>
       <w:r>
-        <w:t>獨立隨機變數: P_{X,Y}(x, y) = P_X(x) * P_Y(y)</w:t>
+        <w:rPr>
+          <w:rFonts w:ascii="Cambria" w:hAnsi="Cambria" w:eastAsia="ＭＳ 明朝" w:cs="Cambria" w:asciiTheme="minorHAnsi" w:hAnsiTheme="minorHAnsi" w:eastAsiaTheme="minorEastAsia" w:csTheme="minorBidi"/>
+          <w:sz w:val="22"/>
+          <w:szCs w:val="22"/>
+        </w:rPr>
+        <w:t>獨立性檢驗 (Independence): 對於表格內「每一個」格子，都必須滿足 P(X=x, Y=y) = P_X(x) * P_Y(y)。只要有一個不符就不獨立！</w:t>
       </w:r>
     </w:p>
     <w:p>
       <w:pPr>
         <w:pStyle w:val="ListBullet"/>
+        <w:ind w:left="360" w:hanging="360"/>
       </w:pPr>
       <w:r>
+        <w:rPr>
+          <w:rFonts w:ascii="Cambria" w:hAnsi="Cambria" w:eastAsia="ＭＳ 明朝" w:cs="Cambria" w:asciiTheme="minorHAnsi" w:hAnsiTheme="minorHAnsi" w:eastAsiaTheme="minorEastAsia" w:csTheme="minorBidi"/>
+          <w:sz w:val="22"/>
+          <w:szCs w:val="22"/>
+        </w:rPr>
         <w:t>線性組合: E[aX + bY] = aE[X] + bE[Y]；若獨立，Var(aX + bY) = a²Var(X) + b²Var(Y)</w:t>
       </w:r>
     </w:p>
     <w:p>
+      <w:pPr>
+        <w:spacing w:after="200" w:line="276" w:lineRule="auto"/>
+      </w:pPr>
       <w:r>
         <w:rPr>
+          <w:rFonts w:ascii="Cambria" w:hAnsi="Cambria" w:eastAsia="ＭＳ 明朝" w:cs="Cambria" w:asciiTheme="minorHAnsi" w:hAnsiTheme="minorHAnsi" w:eastAsiaTheme="minorEastAsia" w:csTheme="minorBidi"/>
           <w:b/>
+          <w:bCs/>
           <w:color w:val="CC0000"/>
+          <w:sz w:val="22"/>
+          <w:szCs w:val="22"/>
         </w:rPr>
         <w:t>⚠️ 弱點提示 (隨時補充)：</w:t>
       </w:r>
       <w:r>
-        <w:t xml:space="preserve"> 多變數超幾何分配(Hypergeometric)題型 (例如：從N個物品中抽出n個)：分母是總組合數 C(N, n)，分子是各項分別取出的組合數相乘。要確定邊際機率的求法。</w:t>
+        <w:rPr>
+          <w:rFonts w:ascii="Cambria" w:hAnsi="Cambria" w:eastAsia="ＭＳ 明朝" w:cs="Cambria" w:asciiTheme="minorHAnsi" w:hAnsiTheme="minorHAnsi" w:eastAsiaTheme="minorEastAsia" w:csTheme="minorBidi"/>
+          <w:sz w:val="22"/>
+          <w:szCs w:val="22"/>
+        </w:rPr>
+        <w:t xml:space="preserve"> 遇到多變數超幾何分配(Hypergeometric)，抽出不放回的機率：分母是總組合數 C(N, n)，分子是各項分別取出的組合數相乘。</w:t>
+      </w:r>
+    </w:p>
+    <w:p>
+      <w:pPr>
+        <w:pStyle w:val="Heading1"/>
+      </w:pPr>
+      <w:r>
+        <w:rPr>
+          <w:rFonts w:ascii="Calibri" w:hAnsi="Calibri" w:eastAsia="ＭＳ ゴシック" w:cs="Calibri" w:asciiTheme="majorHAnsi" w:hAnsiTheme="majorHAnsi" w:eastAsiaTheme="majorEastAsia" w:csTheme="majorBidi"/>
+          <w:b/>
+          <w:bCs/>
+          <w:color w:val="003366"/>
+          <w:sz w:val="28"/>
+          <w:szCs w:val="28"/>
+        </w:rPr>
+        <w:t>Ch 08 測量誤差 (Measurement Error)</w:t>
+      </w:r>
+    </w:p>
+    <w:p>
+      <w:pPr>
+        <w:pStyle w:val="ListBullet"/>
+        <w:ind w:left="360" w:hanging="360"/>
+      </w:pPr>
+      <w:r>
+        <w:rPr>
+          <w:rFonts w:ascii="Cambria" w:hAnsi="Cambria" w:eastAsia="ＭＳ 明朝" w:cs="Cambria" w:asciiTheme="minorHAnsi" w:hAnsiTheme="minorHAnsi" w:eastAsiaTheme="minorEastAsia" w:csTheme="minorBidi"/>
+          <w:sz w:val="22"/>
+          <w:szCs w:val="22"/>
+        </w:rPr>
+        <w:t>量測模型: Measured Value = True Value + Bias (系統誤差) + Random Error (隨機誤差)</w:t>
+      </w:r>
+    </w:p>
+    <w:p>
+      <w:pPr>
+        <w:pStyle w:val="ListBullet"/>
+        <w:ind w:left="360" w:hanging="360"/>
+      </w:pPr>
+      <w:r>
+        <w:rPr>
+          <w:rFonts w:ascii="Cambria" w:hAnsi="Cambria" w:eastAsia="ＭＳ 明朝" w:cs="Cambria" w:asciiTheme="minorHAnsi" w:hAnsiTheme="minorHAnsi" w:eastAsiaTheme="minorEastAsia" w:csTheme="minorBidi"/>
+          <w:sz w:val="22"/>
+          <w:szCs w:val="22"/>
+        </w:rPr>
+        <w:t>系統誤差 (Bias): 每次量測都固定的誤差 (例如體重計沒歸零，每次都少2公斤)。</w:t>
+      </w:r>
+    </w:p>
+    <w:p>
+      <w:pPr>
+        <w:pStyle w:val="ListBullet"/>
+        <w:ind w:left="360" w:hanging="360"/>
+      </w:pPr>
+      <w:r>
+        <w:rPr>
+          <w:rFonts w:ascii="Cambria" w:hAnsi="Cambria" w:eastAsia="ＭＳ 明朝" w:cs="Cambria" w:asciiTheme="minorHAnsi" w:hAnsiTheme="minorHAnsi" w:eastAsiaTheme="minorEastAsia" w:csTheme="minorBidi"/>
+          <w:sz w:val="22"/>
+          <w:szCs w:val="22"/>
+        </w:rPr>
+        <w:t>隨機誤差 (Random Error): 長期平均(期望值)會等於 0。</w:t>
+      </w:r>
+    </w:p>
+    <w:p>
+      <w:pPr>
+        <w:spacing w:after="200" w:line="276" w:lineRule="auto"/>
+      </w:pPr>
+      <w:r>
+        <w:rPr>
+          <w:rFonts w:ascii="Cambria" w:hAnsi="Cambria" w:eastAsia="ＭＳ 明朝" w:cs="Cambria" w:asciiTheme="minorHAnsi" w:hAnsiTheme="minorHAnsi" w:eastAsiaTheme="minorEastAsia" w:csTheme="minorBidi"/>
+          <w:b/>
+          <w:bCs/>
+          <w:color w:val="CC0000"/>
+          <w:sz w:val="22"/>
+          <w:szCs w:val="22"/>
+        </w:rPr>
+        <w:t>⚠️ 弱點提示 (隨時補充)：</w:t>
+      </w:r>
+      <w:r>
+        <w:rPr>
+          <w:rFonts w:ascii="Cambria" w:hAnsi="Cambria" w:eastAsia="ＭＳ 明朝" w:cs="Cambria" w:asciiTheme="minorHAnsi" w:hAnsiTheme="minorHAnsi" w:eastAsiaTheme="minorEastAsia" w:csTheme="minorBidi"/>
+          <w:sz w:val="22"/>
+          <w:szCs w:val="22"/>
+        </w:rPr>
+        <w:t xml:space="preserve"> 量測值的期望值 E[Measured] = True Value + Bias (因為 Random Error 的期望值是 0)。</w:t>
+      </w:r>
+    </w:p>
+    <w:p>
+      <w:pPr>
+        <w:pStyle w:val="Heading1"/>
+      </w:pPr>
+      <w:r>
+        <w:rPr>
+          <w:rFonts w:ascii="Calibri" w:hAnsi="Calibri" w:eastAsia="ＭＳ ゴシック" w:cs="Calibri" w:asciiTheme="majorHAnsi" w:hAnsiTheme="majorHAnsi" w:eastAsiaTheme="majorEastAsia" w:csTheme="majorBidi"/>
+          <w:b/>
+          <w:bCs/>
+          <w:color w:val="003366"/>
+          <w:sz w:val="28"/>
+          <w:szCs w:val="28"/>
+        </w:rPr>
+        <w:t>Ch 09 常態分配 (Normal Distribution)</w:t>
+      </w:r>
+    </w:p>
+    <w:p>
+      <w:pPr>
+        <w:pStyle w:val="ListBullet"/>
+        <w:ind w:left="360" w:hanging="360"/>
+      </w:pPr>
+      <w:r>
+        <w:rPr>
+          <w:rFonts w:ascii="Cambria" w:hAnsi="Cambria" w:eastAsia="ＭＳ 明朝" w:cs="Cambria" w:asciiTheme="minorHAnsi" w:hAnsiTheme="minorHAnsi" w:eastAsiaTheme="minorEastAsia" w:csTheme="minorBidi"/>
+          <w:sz w:val="22"/>
+          <w:szCs w:val="22"/>
+        </w:rPr>
+        <w:t>PDF為鐘型曲線(Bell Shape)，左右對稱於平均數 μ。</w:t>
+      </w:r>
+    </w:p>
+    <w:p>
+      <w:pPr>
+        <w:pStyle w:val="ListBullet"/>
+        <w:ind w:left="360" w:hanging="360"/>
+      </w:pPr>
+      <w:r>
+        <w:rPr>
+          <w:rFonts w:ascii="Cambria" w:hAnsi="Cambria" w:eastAsia="ＭＳ 明朝" w:cs="Cambria" w:asciiTheme="minorHAnsi" w:hAnsiTheme="minorHAnsi" w:eastAsiaTheme="minorEastAsia" w:csTheme="minorBidi"/>
+          <w:sz w:val="22"/>
+          <w:szCs w:val="22"/>
+        </w:rPr>
+        <w:t>68-95-99.7% 法則 (Empirical Rule):</w:t>
+      </w:r>
+    </w:p>
+    <w:p>
+      <w:pPr>
+        <w:pStyle w:val="ListBullet"/>
+        <w:ind w:left="360" w:hanging="360"/>
+      </w:pPr>
+      <w:r>
+        <w:rPr>
+          <w:rFonts w:ascii="Cambria" w:hAnsi="Cambria" w:eastAsia="ＭＳ 明朝" w:cs="Cambria" w:asciiTheme="minorHAnsi" w:hAnsiTheme="minorHAnsi" w:eastAsiaTheme="minorEastAsia" w:csTheme="minorBidi"/>
+          <w:sz w:val="22"/>
+          <w:szCs w:val="22"/>
+        </w:rPr>
+        <w:t xml:space="preserve">  - 落在 μ ± 1σ 之間的機率約為 68%</w:t>
+      </w:r>
+    </w:p>
+    <w:p>
+      <w:pPr>
+        <w:pStyle w:val="ListBullet"/>
+        <w:ind w:left="360" w:hanging="360"/>
+      </w:pPr>
+      <w:r>
+        <w:rPr>
+          <w:rFonts w:ascii="Cambria" w:hAnsi="Cambria" w:eastAsia="ＭＳ 明朝" w:cs="Cambria" w:asciiTheme="minorHAnsi" w:hAnsiTheme="minorHAnsi" w:eastAsiaTheme="minorEastAsia" w:csTheme="minorBidi"/>
+          <w:sz w:val="22"/>
+          <w:szCs w:val="22"/>
+        </w:rPr>
+        <w:t xml:space="preserve">  - 落在 μ ± 2σ 之間的機率約為 95%</w:t>
+      </w:r>
+    </w:p>
+    <w:p>
+      <w:pPr>
+        <w:pStyle w:val="ListBullet"/>
+        <w:ind w:left="360" w:hanging="360"/>
+      </w:pPr>
+      <w:r>
+        <w:rPr>
+          <w:rFonts w:ascii="Cambria" w:hAnsi="Cambria" w:eastAsia="ＭＳ 明朝" w:cs="Cambria" w:asciiTheme="minorHAnsi" w:hAnsiTheme="minorHAnsi" w:eastAsiaTheme="minorEastAsia" w:csTheme="minorBidi"/>
+          <w:sz w:val="22"/>
+          <w:szCs w:val="22"/>
+        </w:rPr>
+        <w:t xml:space="preserve">  - 落在 μ ± 3σ 之間的機率約為 99.7%</w:t>
+      </w:r>
+    </w:p>
+    <w:p>
+      <w:pPr>
+        <w:spacing w:after="200" w:line="276" w:lineRule="auto"/>
+      </w:pPr>
+      <w:r>
+        <w:rPr>
+          <w:rFonts w:ascii="Cambria" w:hAnsi="Cambria" w:eastAsia="ＭＳ 明朝" w:cs="Cambria" w:asciiTheme="minorHAnsi" w:hAnsiTheme="minorHAnsi" w:eastAsiaTheme="minorEastAsia" w:csTheme="minorBidi"/>
+          <w:b/>
+          <w:bCs/>
+          <w:color w:val="CC0000"/>
+          <w:sz w:val="22"/>
+          <w:szCs w:val="22"/>
+        </w:rPr>
+        <w:t>⚠️ 弱點提示 (隨時補充)：</w:t>
+      </w:r>
+      <w:r>
+        <w:rPr>
+          <w:rFonts w:ascii="Cambria" w:hAnsi="Cambria" w:eastAsia="ＭＳ 明朝" w:cs="Cambria" w:asciiTheme="minorHAnsi" w:hAnsiTheme="minorHAnsi" w:eastAsiaTheme="minorEastAsia" w:csTheme="minorBidi"/>
+          <w:sz w:val="22"/>
+          <w:szCs w:val="22"/>
+        </w:rPr>
+        <w:t xml:space="preserve"> 注意尾部機率陷阱！因為對稱，若要求「大於 μ + 2σ」的機率，算法是 (100% - 95%) / 2 = 2.5%。</w:t>
       </w:r>
     </w:p>
     <w:sectPr>
       <w:pgSz w:w="12240" w:h="15840"/>
       <w:pgMar w:top="720" w:right="720" w:bottom="720" w:left="720" w:header="720" w:footer="720" w:gutter="0"/>
-      <w:cols w:space="720"/>
       <w:docGrid w:linePitch="360"/>
     </w:sectPr>
   </w:body>

</xml_diff>

<commit_message>
Auto sync: 2026-06-29 13:55
</commit_message>
<xml_diff>
--- a/機率與統計小抄.docx
+++ b/機率與統計小抄.docx
@@ -1,6 +1,6 @@
 
 <file path=word/document.xml><?xml version="1.0" encoding="utf-8"?>
-<w:document xmlns:wpc="http://schemas.microsoft.com/office/word/2010/wordprocessingCanvas" xmlns:mc="http://schemas.openxmlformats.org/markup-compatibility/2006" xmlns:o="urn:schemas-microsoft-com:office:office" xmlns:r="http://schemas.openxmlformats.org/officeDocument/2006/relationships" xmlns:m="http://schemas.openxmlformats.org/officeDocument/2006/math" xmlns:v="urn:schemas-microsoft-com:vml" xmlns:wp14="http://schemas.microsoft.com/office/word/2010/wordprocessingDrawing" xmlns:wp="http://schemas.openxmlformats.org/drawingml/2006/wordprocessingDrawing" xmlns:w10="urn:schemas-microsoft-com:office:word" xmlns:w="http://schemas.openxmlformats.org/wordprocessingml/2006/main" xmlns:w14="http://schemas.microsoft.com/office/word/2010/wordml" xmlns:w15="http://schemas.microsoft.com/office/word/2012/wordml" xmlns:w16se="http://schemas.microsoft.com/office/word/2015/wordml/symex" xmlns:w16cid="http://schemas.microsoft.com/office/word/2016/wordml/cid" xmlns:w16="http://schemas.microsoft.com/office/word/2018/wordml" xmlns:w16cex="http://schemas.microsoft.com/office/word/2018/wordml/cex" xmlns:w16sdtdh="http://schemas.microsoft.com/office/word/2020/wordml/sdtdatahash" xmlns:wne="http://schemas.microsoft.com/office/word/2006/wordml" xmlns:wpg="http://schemas.microsoft.com/office/word/2010/wordprocessingGroup" xmlns:wps="http://schemas.microsoft.com/office/word/2010/wordprocessingShape" mc:Ignorable="w14 w15 w16se w16cid w16 w16cex w16sdtdh wp14">
+<w:document xmlns:wpc="http://schemas.microsoft.com/office/word/2010/wordprocessingCanvas" xmlns:mo="http://schemas.microsoft.com/office/mac/office/2008/main" xmlns:mc="http://schemas.openxmlformats.org/markup-compatibility/2006" xmlns:mv="urn:schemas-microsoft-com:mac:vml" xmlns:o="urn:schemas-microsoft-com:office:office" xmlns:r="http://schemas.openxmlformats.org/officeDocument/2006/relationships" xmlns:m="http://schemas.openxmlformats.org/officeDocument/2006/math" xmlns:v="urn:schemas-microsoft-com:vml" xmlns:wp14="http://schemas.microsoft.com/office/word/2010/wordprocessingDrawing" xmlns:wp="http://schemas.openxmlformats.org/drawingml/2006/wordprocessingDrawing" xmlns:w10="urn:schemas-microsoft-com:office:word" xmlns:w="http://schemas.openxmlformats.org/wordprocessingml/2006/main" xmlns:w14="http://schemas.microsoft.com/office/word/2010/wordml" xmlns:wpg="http://schemas.microsoft.com/office/word/2010/wordprocessingGroup" xmlns:wpi="http://schemas.microsoft.com/office/word/2010/wordprocessingInk" xmlns:wne="http://schemas.microsoft.com/office/word/2006/wordml" xmlns:wps="http://schemas.microsoft.com/office/word/2010/wordprocessingShape" mc:Ignorable="w14 wp14">
   <w:body>
     <w:p>
       <w:pPr>
@@ -8,673 +8,285 @@
         <w:jc w:val="center"/>
       </w:pPr>
       <w:r>
-        <w:rPr>
-          <w:rFonts w:ascii="Calibri" w:hAnsi="Calibri" w:eastAsia="ＭＳ ゴシック" w:cs="Calibri" w:asciiTheme="majorHAnsi" w:hAnsiTheme="majorHAnsi" w:eastAsiaTheme="majorEastAsia" w:csTheme="majorBidi"/>
-          <w:color w:val="17365D" w:themeColor="text2" w:themeShade="BF"/>
-          <w:spacing w:val="5"/>
-          <w:kern w:val="28"/>
-          <w:sz w:val="52"/>
-          <w:szCs w:val="52"/>
-        </w:rPr>
-        <w:t>機率與統計 考前必備小抄 (Ch2, 3.1-3.2, 4.1-4.7)</w:t>
+        <w:t>機率與統計 考前終極小抄 (含所有連續分配與CLT)</w:t>
       </w:r>
     </w:p>
     <w:p>
       <w:pPr>
-        <w:pStyle w:val="Heading1"/>
+        <w:pStyle w:val="Heading2"/>
+        <w:spacing w:before="160" w:after="40"/>
       </w:pPr>
       <w:r>
         <w:rPr>
-          <w:rFonts w:ascii="Calibri" w:hAnsi="Calibri" w:eastAsia="ＭＳ ゴシック" w:cs="Calibri" w:asciiTheme="majorHAnsi" w:hAnsiTheme="majorHAnsi" w:eastAsiaTheme="majorEastAsia" w:csTheme="majorBidi"/>
-          <w:b/>
-          <w:bCs/>
           <w:color w:val="003366"/>
-          <w:sz w:val="28"/>
-          <w:szCs w:val="28"/>
+          <w:sz w:val="24"/>
         </w:rPr>
-        <w:t>Ch 2 機率與貝氏定理 (Probability &amp; Bayes' Theorem)</w:t>
+        <w:t>Ch 2 機率與貝氏定理</w:t>
       </w:r>
     </w:p>
     <w:p>
       <w:pPr>
         <w:pStyle w:val="ListBullet"/>
-        <w:ind w:left="360" w:hanging="360"/>
+        <w:spacing w:after="20"/>
       </w:pPr>
       <w:r>
-        <w:rPr>
-          <w:rFonts w:ascii="Cambria" w:hAnsi="Cambria" w:eastAsia="ＭＳ 明朝" w:cs="Cambria" w:asciiTheme="minorHAnsi" w:hAnsiTheme="minorHAnsi" w:eastAsiaTheme="minorEastAsia" w:csTheme="minorBidi"/>
-          <w:sz w:val="22"/>
-          <w:szCs w:val="22"/>
-        </w:rPr>
-        <w:t>聯集機率 (Union): P(A ∪ B) = P(A) + P(B) - P(A ∩ B)</w:t>
+        <w:t>條件機率: P(A | B) = P(A ∩ B) / P(B) | 獨立: P(A ∩ B) = P(A)P(B) (互斥為 P(A ∩ B)=0，兩者不同)</w:t>
       </w:r>
     </w:p>
     <w:p>
       <w:pPr>
         <w:pStyle w:val="ListBullet"/>
-        <w:ind w:left="360" w:hanging="360"/>
+        <w:spacing w:after="20"/>
+      </w:pPr>
+      <w:r>
+        <w:t>全機率: P(B) = Σ P(B|A_i)P(A_i) | 貝氏定理: P(A_i|B) = [P(B|A_i)P(A_i)] / P(B)</w:t>
+      </w:r>
+    </w:p>
+    <w:p>
+      <w:pPr>
+        <w:spacing w:after="80"/>
       </w:pPr>
       <w:r>
         <w:rPr>
-          <w:rFonts w:ascii="Cambria" w:hAnsi="Cambria" w:eastAsia="ＭＳ 明朝" w:cs="Cambria" w:asciiTheme="minorHAnsi" w:hAnsiTheme="minorHAnsi" w:eastAsiaTheme="minorEastAsia" w:csTheme="minorBidi"/>
-          <w:sz w:val="22"/>
-          <w:szCs w:val="22"/>
+          <w:b/>
+          <w:color w:val="CC0000"/>
         </w:rPr>
-        <w:t>條件機率 (Conditional Prob): P(A | B) = P(A ∩ B) / P(B)</w:t>
+        <w:t xml:space="preserve">⚠️ 陷阱: </w:t>
+      </w:r>
+      <w:r>
+        <w:t>抽出不放回注意分母遞減。瑕疵分類題必畫樹狀圖。</w:t>
+      </w:r>
+    </w:p>
+    <w:p>
+      <w:pPr>
+        <w:pStyle w:val="Heading2"/>
+        <w:spacing w:before="160" w:after="40"/>
+      </w:pPr>
+      <w:r>
+        <w:rPr>
+          <w:color w:val="003366"/>
+          <w:sz w:val="24"/>
+        </w:rPr>
+        <w:t>Ch 3 離散型分配 (Discrete)</w:t>
       </w:r>
     </w:p>
     <w:p>
       <w:pPr>
         <w:pStyle w:val="ListBullet"/>
-        <w:ind w:left="360" w:hanging="360"/>
+        <w:spacing w:after="20"/>
       </w:pPr>
       <w:r>
-        <w:rPr>
-          <w:rFonts w:ascii="Cambria" w:hAnsi="Cambria" w:eastAsia="ＭＳ 明朝" w:cs="Cambria" w:asciiTheme="minorHAnsi" w:hAnsiTheme="minorHAnsi" w:eastAsiaTheme="minorEastAsia" w:csTheme="minorBidi"/>
-          <w:sz w:val="22"/>
-          <w:szCs w:val="22"/>
-        </w:rPr>
-        <w:t xml:space="preserve">獨立事件 (Independent): P(A ∩ B) = P(A)P(B)  (💡注意：獨立與「互斥」不同，互斥是P(A ∩ B) = 0)</w:t>
+        <w:t>Bernoulli(p): P(1)=p。E=p, Var=p(1-p) | Binomial(n,p): n次中k次成功。E=np, Var=np(1-p)</w:t>
       </w:r>
     </w:p>
     <w:p>
       <w:pPr>
         <w:pStyle w:val="ListBullet"/>
-        <w:ind w:left="360" w:hanging="360"/>
+        <w:spacing w:after="20"/>
       </w:pPr>
       <w:r>
-        <w:rPr>
-          <w:rFonts w:ascii="Cambria" w:hAnsi="Cambria" w:eastAsia="ＭＳ 明朝" w:cs="Cambria" w:asciiTheme="minorHAnsi" w:hAnsiTheme="minorHAnsi" w:eastAsiaTheme="minorEastAsia" w:csTheme="minorBidi"/>
-          <w:sz w:val="22"/>
-          <w:szCs w:val="22"/>
-        </w:rPr>
-        <w:t>全機率定理 (Law of Total Prob): P(B) = Σ P(B | A_i) P(A_i)</w:t>
+        <w:t>Poisson(λ): P(k)=(e^-λ * λ^k)/k!。E=λ, Var=λ (時間若改變，λ要按比例縮放)</w:t>
       </w:r>
     </w:p>
     <w:p>
       <w:pPr>
         <w:pStyle w:val="ListBullet"/>
-        <w:ind w:left="360" w:hanging="360"/>
+        <w:spacing w:after="20"/>
       </w:pPr>
       <w:r>
-        <w:rPr>
-          <w:rFonts w:ascii="Cambria" w:hAnsi="Cambria" w:eastAsia="ＭＳ 明朝" w:cs="Cambria" w:asciiTheme="minorHAnsi" w:hAnsiTheme="minorHAnsi" w:eastAsiaTheme="minorEastAsia" w:csTheme="minorBidi"/>
-          <w:sz w:val="22"/>
-          <w:szCs w:val="22"/>
-        </w:rPr>
-        <w:t>貝氏定理 (Bayes' Theorem): P(A_i | B) = [P(B | A_i) P(A_i)] / P(B)</w:t>
-      </w:r>
-    </w:p>
-    <w:p>
-      <w:pPr>
-        <w:spacing w:after="200" w:line="276" w:lineRule="auto"/>
-      </w:pPr>
-      <w:r>
-        <w:rPr>
-          <w:rFonts w:ascii="Cambria" w:hAnsi="Cambria" w:eastAsia="ＭＳ 明朝" w:cs="Cambria" w:asciiTheme="minorHAnsi" w:hAnsiTheme="minorHAnsi" w:eastAsiaTheme="minorEastAsia" w:csTheme="minorBidi"/>
-          <w:b/>
-          <w:bCs/>
-          <w:color w:val="CC0000"/>
-          <w:sz w:val="22"/>
-          <w:szCs w:val="22"/>
-        </w:rPr>
-        <w:t>⚠️ 弱點提示 (隨時補充)：</w:t>
-      </w:r>
-      <w:r>
-        <w:rPr>
-          <w:rFonts w:ascii="Cambria" w:hAnsi="Cambria" w:eastAsia="ＭＳ 明朝" w:cs="Cambria" w:asciiTheme="minorHAnsi" w:hAnsiTheme="minorHAnsi" w:eastAsiaTheme="minorEastAsia" w:csTheme="minorBidi"/>
-          <w:sz w:val="22"/>
-          <w:szCs w:val="22"/>
-        </w:rPr>
-        <w:t xml:space="preserve"> 遇到「抽菸與疾病」、「瑕疵品分類」等歷屆題型，立刻畫樹狀圖(Tree Diagram)！先將分支機率標上去。</w:t>
-      </w:r>
-    </w:p>
-    <w:p>
-      <w:pPr>
-        <w:spacing w:after="200" w:line="276" w:lineRule="auto"/>
-      </w:pPr>
-      <w:r>
-        <w:rPr>
-          <w:rFonts w:ascii="Cambria" w:hAnsi="Cambria" w:eastAsia="ＭＳ 明朝" w:cs="Cambria" w:asciiTheme="minorHAnsi" w:hAnsiTheme="minorHAnsi" w:eastAsiaTheme="minorEastAsia" w:csTheme="minorBidi"/>
-          <w:b/>
-          <w:bCs/>
-          <w:color w:val="CC0000"/>
-          <w:sz w:val="22"/>
-          <w:szCs w:val="22"/>
-        </w:rPr>
-        <w:t>⚠️ 弱點提示 (隨時補充)：</w:t>
-      </w:r>
-      <w:r>
-        <w:rPr>
-          <w:rFonts w:ascii="Cambria" w:hAnsi="Cambria" w:eastAsia="ＭＳ 明朝" w:cs="Cambria" w:asciiTheme="minorHAnsi" w:hAnsiTheme="minorHAnsi" w:eastAsiaTheme="minorEastAsia" w:csTheme="minorBidi"/>
-          <w:sz w:val="22"/>
-          <w:szCs w:val="22"/>
-        </w:rPr>
-        <w:t xml:space="preserve"> 注意「抽出不放回(Without Replacement)」的情況，分母與分子會隨每次抽取遞減。</w:t>
-      </w:r>
-    </w:p>
-    <w:p>
-      <w:pPr>
-        <w:pStyle w:val="Heading1"/>
-      </w:pPr>
-      <w:r>
-        <w:rPr>
-          <w:rFonts w:ascii="Calibri" w:hAnsi="Calibri" w:eastAsia="ＭＳ ゴシック" w:cs="Calibri" w:asciiTheme="majorHAnsi" w:hAnsiTheme="majorHAnsi" w:eastAsiaTheme="majorEastAsia" w:csTheme="majorBidi"/>
-          <w:b/>
-          <w:bCs/>
-          <w:color w:val="003366"/>
-          <w:sz w:val="28"/>
-          <w:szCs w:val="28"/>
-        </w:rPr>
-        <w:t>Ch 3.1 - 3.2 離散型隨機變數 (Discrete Random Variables)</w:t>
+        <w:t>Hypergeometric(N,K,n): 抽出不放回。P(k)=[C(K,k)*C(N-K,n-k)] / C(N,n)</w:t>
       </w:r>
     </w:p>
     <w:p>
       <w:pPr>
         <w:pStyle w:val="ListBullet"/>
-        <w:ind w:left="360" w:hanging="360"/>
+        <w:spacing w:after="20"/>
+      </w:pPr>
+      <w:r>
+        <w:t>Negative Binomial(r,p): 直到第r次成功共需n次。P(n)=C(n-1, r-1) * p^r * (1-p)^(n-r)。E=r/p</w:t>
+      </w:r>
+    </w:p>
+    <w:p>
+      <w:pPr>
+        <w:pStyle w:val="Heading2"/>
+        <w:spacing w:before="160" w:after="40"/>
       </w:pPr>
       <w:r>
         <w:rPr>
-          <w:rFonts w:ascii="Cambria" w:hAnsi="Cambria" w:eastAsia="ＭＳ 明朝" w:cs="Cambria" w:asciiTheme="minorHAnsi" w:hAnsiTheme="minorHAnsi" w:eastAsiaTheme="minorEastAsia" w:csTheme="minorBidi"/>
-          <w:sz w:val="22"/>
-          <w:szCs w:val="22"/>
+          <w:color w:val="003366"/>
+          <w:sz w:val="24"/>
         </w:rPr>
-        <w:t>機率質量函數 (PMF): P_X(x) = P(X = x)</w:t>
+        <w:t>Ch 4 &amp; 9 連續型分配 (Continuous)</w:t>
       </w:r>
     </w:p>
     <w:p>
       <w:pPr>
         <w:pStyle w:val="ListBullet"/>
-        <w:ind w:left="360" w:hanging="360"/>
+        <w:spacing w:after="20"/>
       </w:pPr>
       <w:r>
-        <w:rPr>
-          <w:rFonts w:ascii="Cambria" w:hAnsi="Cambria" w:eastAsia="ＭＳ 明朝" w:cs="Cambria" w:asciiTheme="minorHAnsi" w:hAnsiTheme="minorHAnsi" w:eastAsiaTheme="minorEastAsia" w:csTheme="minorBidi"/>
-          <w:sz w:val="22"/>
-          <w:szCs w:val="22"/>
-        </w:rPr>
-        <w:t>期望值 (Expected Value): E[X] = Σ x * P_X(x)</w:t>
+        <w:t>均勻 Uniform(a,b): f(x)=1/(b-a), E=(a+b)/2, Var=(b-a)²/12</w:t>
       </w:r>
     </w:p>
     <w:p>
       <w:pPr>
         <w:pStyle w:val="ListBullet"/>
-        <w:ind w:left="360" w:hanging="360"/>
+        <w:spacing w:after="20"/>
       </w:pPr>
       <w:r>
-        <w:rPr>
-          <w:rFonts w:ascii="Cambria" w:hAnsi="Cambria" w:eastAsia="ＭＳ 明朝" w:cs="Cambria" w:asciiTheme="minorHAnsi" w:hAnsiTheme="minorHAnsi" w:eastAsiaTheme="minorEastAsia" w:csTheme="minorBidi"/>
-          <w:sz w:val="22"/>
-          <w:szCs w:val="22"/>
-        </w:rPr>
-        <w:t>函數期望值: E[g(X)] = Σ g(x) * P_X(x)</w:t>
+        <w:t>常態 Normal(μ,σ²): 鐘型對稱。68-95-99.7% 法則 (μ±1σ, μ±2σ, μ±3σ)。標準化 Z = (X-μ)/σ</w:t>
       </w:r>
     </w:p>
     <w:p>
       <w:pPr>
         <w:pStyle w:val="ListBullet"/>
-        <w:ind w:left="360" w:hanging="360"/>
+        <w:spacing w:after="20"/>
       </w:pPr>
       <w:r>
-        <w:rPr>
-          <w:rFonts w:ascii="Cambria" w:hAnsi="Cambria" w:eastAsia="ＭＳ 明朝" w:cs="Cambria" w:asciiTheme="minorHAnsi" w:hAnsiTheme="minorHAnsi" w:eastAsiaTheme="minorEastAsia" w:csTheme="minorBidi"/>
-          <w:sz w:val="22"/>
-          <w:szCs w:val="22"/>
-        </w:rPr>
-        <w:t>變異數 (Variance): Var(X) = E[(X - μ)²] = E[X²] - (E[X])²</w:t>
+        <w:t>對數常態 Lognormal: 若 X~N(μ,σ²), 則 Y=e^X 為對數常態。</w:t>
       </w:r>
     </w:p>
     <w:p>
       <w:pPr>
         <w:pStyle w:val="ListBullet"/>
-        <w:ind w:left="360" w:hanging="360"/>
+        <w:spacing w:after="20"/>
       </w:pPr>
       <w:r>
-        <w:rPr>
-          <w:rFonts w:ascii="Cambria" w:hAnsi="Cambria" w:eastAsia="ＭＳ 明朝" w:cs="Cambria" w:asciiTheme="minorHAnsi" w:hAnsiTheme="minorHAnsi" w:eastAsiaTheme="minorEastAsia" w:csTheme="minorBidi"/>
-          <w:sz w:val="22"/>
-          <w:szCs w:val="22"/>
-        </w:rPr>
-        <w:t>標準差 (Standard Deviation): σ = √Var(X)</w:t>
-      </w:r>
-    </w:p>
-    <w:p>
-      <w:pPr>
-        <w:spacing w:after="200" w:line="276" w:lineRule="auto"/>
-      </w:pPr>
-      <w:r>
-        <w:rPr>
-          <w:rFonts w:ascii="Cambria" w:hAnsi="Cambria" w:eastAsia="ＭＳ 明朝" w:cs="Cambria" w:asciiTheme="minorHAnsi" w:hAnsiTheme="minorHAnsi" w:eastAsiaTheme="minorEastAsia" w:csTheme="minorBidi"/>
-          <w:b/>
-          <w:bCs/>
-          <w:color w:val="CC0000"/>
-          <w:sz w:val="22"/>
-          <w:szCs w:val="22"/>
-        </w:rPr>
-        <w:t>⚠️ 弱點提示 (隨時補充)：</w:t>
-      </w:r>
-      <w:r>
-        <w:rPr>
-          <w:rFonts w:ascii="Cambria" w:hAnsi="Cambria" w:eastAsia="ＭＳ 明朝" w:cs="Cambria" w:asciiTheme="minorHAnsi" w:hAnsiTheme="minorHAnsi" w:eastAsiaTheme="minorEastAsia" w:csTheme="minorBidi"/>
-          <w:sz w:val="22"/>
-          <w:szCs w:val="22"/>
-        </w:rPr>
-        <w:t xml:space="preserve"> 若題目要求計算 Var(X²)，公式為 Var(X²) = E[X⁴] - (E[X²])²，要算出每個x的四次方。這在歷屆題有出過，不要跟 E[X²] 搞混。</w:t>
-      </w:r>
-    </w:p>
-    <w:p>
-      <w:pPr>
-        <w:pStyle w:val="Heading1"/>
-      </w:pPr>
-      <w:r>
-        <w:rPr>
-          <w:rFonts w:ascii="Calibri" w:hAnsi="Calibri" w:eastAsia="ＭＳ ゴシック" w:cs="Calibri" w:asciiTheme="majorHAnsi" w:hAnsiTheme="majorHAnsi" w:eastAsiaTheme="majorEastAsia" w:csTheme="majorBidi"/>
-          <w:b/>
-          <w:bCs/>
-          <w:color w:val="003366"/>
-          <w:sz w:val="28"/>
-          <w:szCs w:val="28"/>
-        </w:rPr>
-        <w:t>Ch 4.1 - 4.7 連續型隨機變數 (Continuous Random Variables)</w:t>
+        <w:t>指數 Exponential(λ): 等待時間。f(x)=λe^(-λx), E=1/λ, Var=1/λ²。(具備 Lack of Memory 失憶性: P(T&gt;t+s|T&gt;s)=P(T&gt;t))</w:t>
       </w:r>
     </w:p>
     <w:p>
       <w:pPr>
         <w:pStyle w:val="ListBullet"/>
-        <w:ind w:left="360" w:hanging="360"/>
+        <w:spacing w:after="20"/>
+      </w:pPr>
+      <w:r>
+        <w:t>Gamma(r,λ): 等待第r次發生的時間。E=r/λ, Var=r/λ² | Weibull: 常估算元件壽命。</w:t>
+      </w:r>
+    </w:p>
+    <w:p>
+      <w:pPr>
+        <w:spacing w:after="80"/>
       </w:pPr>
       <w:r>
         <w:rPr>
-          <w:rFonts w:ascii="Cambria" w:hAnsi="Cambria" w:eastAsia="ＭＳ 明朝" w:cs="Cambria" w:asciiTheme="minorHAnsi" w:hAnsiTheme="minorHAnsi" w:eastAsiaTheme="minorEastAsia" w:csTheme="minorBidi"/>
-          <w:sz w:val="22"/>
-          <w:szCs w:val="22"/>
+          <w:b/>
+          <w:color w:val="CC0000"/>
         </w:rPr>
-        <w:t>機率密度函數 (PDF) 性質: ∫ f(x) dx = 1 (在所有可能區間積分為1)</w:t>
+        <w:t xml:space="preserve">⚠️ 陷阱: </w:t>
+      </w:r>
+      <w:r>
+        <w:t>求條件期望值 E[X | X≤a] 必除以 P(X≤a)。常態尾部機率(如大於μ+2σ)是 (100%-95%)/2 = 2.5%。</w:t>
+      </w:r>
+    </w:p>
+    <w:p>
+      <w:pPr>
+        <w:pStyle w:val="Heading2"/>
+        <w:spacing w:before="160" w:after="40"/>
+      </w:pPr>
+      <w:r>
+        <w:rPr>
+          <w:color w:val="003366"/>
+          <w:sz w:val="24"/>
+        </w:rPr>
+        <w:t>Ch 6 聯合機率 &amp; Ch 8 測量誤差與點估計</w:t>
       </w:r>
     </w:p>
     <w:p>
       <w:pPr>
         <w:pStyle w:val="ListBullet"/>
-        <w:ind w:left="360" w:hanging="360"/>
+        <w:spacing w:after="20"/>
       </w:pPr>
       <w:r>
-        <w:rPr>
-          <w:rFonts w:ascii="Cambria" w:hAnsi="Cambria" w:eastAsia="ＭＳ 明朝" w:cs="Cambria" w:asciiTheme="minorHAnsi" w:hAnsiTheme="minorHAnsi" w:eastAsiaTheme="minorEastAsia" w:csTheme="minorBidi"/>
-          <w:sz w:val="22"/>
-          <w:szCs w:val="22"/>
-        </w:rPr>
-        <w:t>累積分布函數 (CDF): F(x) = P(X ≤ x) = ∫_(-∞)^x f(t) dt</w:t>
+        <w:t>邊際機率: 從表格中把「同一列」或「同一欄」相加。獨立性: 每個格子皆滿足 P(x,y)=P(x)*P(y)</w:t>
       </w:r>
     </w:p>
     <w:p>
       <w:pPr>
         <w:pStyle w:val="ListBullet"/>
-        <w:ind w:left="360" w:hanging="360"/>
+        <w:spacing w:after="20"/>
       </w:pPr>
       <w:r>
-        <w:rPr>
-          <w:rFonts w:ascii="Cambria" w:hAnsi="Cambria" w:eastAsia="ＭＳ 明朝" w:cs="Cambria" w:asciiTheme="minorHAnsi" w:hAnsiTheme="minorHAnsi" w:eastAsiaTheme="minorEastAsia" w:csTheme="minorBidi"/>
-          <w:sz w:val="22"/>
-          <w:szCs w:val="22"/>
-        </w:rPr>
-        <w:t>期望值 (Expected Value): E[X] = ∫ x * f(x) dx</w:t>
+        <w:t>期望值/變異數線性組合: E[aX±bY+c] = aE[X]±bE[Y]+c | 若獨立，Var(aX±bY+c) = a²Var(X) + b²Var(Y)</w:t>
       </w:r>
     </w:p>
     <w:p>
       <w:pPr>
         <w:pStyle w:val="ListBullet"/>
-        <w:ind w:left="360" w:hanging="360"/>
+        <w:spacing w:after="20"/>
       </w:pPr>
       <w:r>
-        <w:rPr>
-          <w:rFonts w:ascii="Cambria" w:hAnsi="Cambria" w:eastAsia="ＭＳ 明朝" w:cs="Cambria" w:asciiTheme="minorHAnsi" w:hAnsiTheme="minorHAnsi" w:eastAsiaTheme="minorEastAsia" w:csTheme="minorBidi"/>
-          <w:sz w:val="22"/>
-          <w:szCs w:val="22"/>
-        </w:rPr>
-        <w:t>變異數 (Variance): Var(X) = E[X²] - (E[X])² = ∫ x² * f(x) dx - μ²</w:t>
+        <w:t>誤差模型: Measured = True + Bias(系統誤差, 固定) + Random Error(隨機誤差, E=0)</w:t>
       </w:r>
     </w:p>
     <w:p>
       <w:pPr>
         <w:pStyle w:val="ListBullet"/>
-        <w:ind w:left="360" w:hanging="360"/>
+        <w:spacing w:after="20"/>
       </w:pPr>
       <w:r>
-        <w:rPr>
-          <w:rFonts w:ascii="Cambria" w:hAnsi="Cambria" w:eastAsia="ＭＳ 明朝" w:cs="Cambria" w:asciiTheme="minorHAnsi" w:hAnsiTheme="minorHAnsi" w:eastAsiaTheme="minorEastAsia" w:csTheme="minorBidi"/>
-          <w:sz w:val="22"/>
-          <w:szCs w:val="22"/>
-        </w:rPr>
-        <w:t>均勻分配 (Uniform Distribution): f(x) = 1/(b-a), 期望值 (a+b)/2, 變異數 (b-a)²/12</w:t>
+        <w:t>點估計 MSE (Mean Squared Error) = Var(θ) + [Bias(θ)]²。樣本平均是Unbiased，樣本變異數是Asymptotically Unbiased。</w:t>
       </w:r>
     </w:p>
     <w:p>
       <w:pPr>
-        <w:spacing w:after="200" w:line="276" w:lineRule="auto"/>
+        <w:pStyle w:val="Heading2"/>
+        <w:spacing w:before="160" w:after="40"/>
       </w:pPr>
       <w:r>
         <w:rPr>
-          <w:rFonts w:ascii="Cambria" w:hAnsi="Cambria" w:eastAsia="ＭＳ 明朝" w:cs="Cambria" w:asciiTheme="minorHAnsi" w:hAnsiTheme="minorHAnsi" w:eastAsiaTheme="minorEastAsia" w:csTheme="minorBidi"/>
-          <w:b/>
-          <w:bCs/>
-          <w:color w:val="CC0000"/>
-          <w:sz w:val="22"/>
-          <w:szCs w:val="22"/>
+          <w:color w:val="003366"/>
+          <w:sz w:val="24"/>
         </w:rPr>
-        <w:t>⚠️ 弱點提示 (隨時補充)：</w:t>
-      </w:r>
-      <w:r>
-        <w:rPr>
-          <w:rFonts w:ascii="Cambria" w:hAnsi="Cambria" w:eastAsia="ＭＳ 明朝" w:cs="Cambria" w:asciiTheme="minorHAnsi" w:hAnsiTheme="minorHAnsi" w:eastAsiaTheme="minorEastAsia" w:csTheme="minorBidi"/>
-          <w:sz w:val="22"/>
-          <w:szCs w:val="22"/>
-        </w:rPr>
-        <w:t xml:space="preserve"> 條件期望值 E[X | X ≤ a] 的陷阱：計算時必須要「除以 P(X ≤ a)」。</w:t>
-      </w:r>
-      <w:r>
-        <w:br w:type="textWrapping"/>
-      </w:r>
-      <w:r>
-        <w:rPr>
-          <w:rFonts w:ascii="Cambria" w:hAnsi="Cambria" w:eastAsia="ＭＳ 明朝" w:cs="Cambria" w:asciiTheme="minorHAnsi" w:hAnsiTheme="minorHAnsi" w:eastAsiaTheme="minorEastAsia" w:csTheme="minorBidi"/>
-          <w:sz w:val="22"/>
-          <w:szCs w:val="22"/>
-        </w:rPr>
-        <w:t>公式: E[X | X ≤ a] = ( ∫_(-∞)^a x*f(x) dx ) / P(X ≤ a)。歷屆題常考給定條件下的期望值！</w:t>
-      </w:r>
-    </w:p>
-    <w:p>
-      <w:pPr>
-        <w:pStyle w:val="Heading1"/>
-      </w:pPr>
-      <w:r>
-        <w:rPr>
-          <w:rFonts w:ascii="Calibri" w:hAnsi="Calibri" w:eastAsia="ＭＳ ゴシック" w:cs="Calibri" w:asciiTheme="majorHAnsi" w:hAnsiTheme="majorHAnsi" w:eastAsiaTheme="majorEastAsia" w:csTheme="majorBidi"/>
-          <w:b/>
-          <w:bCs/>
-          <w:color w:val="003366"/>
-          <w:sz w:val="28"/>
-          <w:szCs w:val="28"/>
-        </w:rPr>
-        <w:t>Ch 06 聯合機率分配 (Joint Probability)</w:t>
+        <w:t>中央極限定理 (CLT) &amp; 常態近似</w:t>
       </w:r>
     </w:p>
     <w:p>
       <w:pPr>
         <w:pStyle w:val="ListBullet"/>
-        <w:ind w:left="360" w:hanging="360"/>
+        <w:spacing w:after="20"/>
       </w:pPr>
       <w:r>
-        <w:rPr>
-          <w:rFonts w:ascii="Cambria" w:hAnsi="Cambria" w:eastAsia="ＭＳ 明朝" w:cs="Cambria" w:asciiTheme="minorHAnsi" w:hAnsiTheme="minorHAnsi" w:eastAsiaTheme="minorEastAsia" w:csTheme="minorBidi"/>
-          <w:sz w:val="22"/>
-          <w:szCs w:val="22"/>
-        </w:rPr>
-        <w:t>聯合 PMF: P_{X,Y}(x, y)</w:t>
+        <w:t>CLT: 若 n&gt;30，樣本平均 X̄ 近似常態 N(μ, σ²/n)；樣本總和 S_n 近似 N(nμ, nσ²)。</w:t>
       </w:r>
     </w:p>
     <w:p>
       <w:pPr>
         <w:pStyle w:val="ListBullet"/>
-        <w:ind w:left="360" w:hanging="360"/>
+        <w:spacing w:after="20"/>
       </w:pPr>
       <w:r>
-        <w:rPr>
-          <w:rFonts w:ascii="Cambria" w:hAnsi="Cambria" w:eastAsia="ＭＳ 明朝" w:cs="Cambria" w:asciiTheme="minorHAnsi" w:hAnsiTheme="minorHAnsi" w:eastAsiaTheme="minorEastAsia" w:csTheme="minorBidi"/>
-          <w:sz w:val="22"/>
-          <w:szCs w:val="22"/>
-        </w:rPr>
-        <w:t>邊際機率 (Marginal Prob): 從表格中把「同一列(Row)」或「同一欄(Column)」全部加起來。即 P_X(x) = Σ_y P_{X,Y}(x, y)</w:t>
+        <w:t>近似 Binomial: 若 np&gt;10 且 n(1-p)&gt;10，則 Binomial(n,p) 近似 N(np, np(1-p))。</w:t>
       </w:r>
     </w:p>
     <w:p>
       <w:pPr>
         <w:pStyle w:val="ListBullet"/>
-        <w:ind w:left="360" w:hanging="360"/>
+        <w:spacing w:after="20"/>
       </w:pPr>
       <w:r>
-        <w:rPr>
-          <w:rFonts w:ascii="Cambria" w:hAnsi="Cambria" w:eastAsia="ＭＳ 明朝" w:cs="Cambria" w:asciiTheme="minorHAnsi" w:hAnsiTheme="minorHAnsi" w:eastAsiaTheme="minorEastAsia" w:csTheme="minorBidi"/>
-          <w:sz w:val="22"/>
-          <w:szCs w:val="22"/>
-        </w:rPr>
-        <w:t>獨立性檢驗 (Independence): 對於表格內「每一個」格子，都必須滿足 P(X=x, Y=y) = P_X(x) * P_Y(y)。只要有一個不符就不獨立！</w:t>
+        <w:t>近似 Poisson: 若 λ&gt;10，則 Poisson(λ) 近似 N(λ, λ)。</w:t>
       </w:r>
     </w:p>
     <w:p>
       <w:pPr>
-        <w:pStyle w:val="ListBullet"/>
-        <w:ind w:left="360" w:hanging="360"/>
+        <w:spacing w:after="80"/>
       </w:pPr>
       <w:r>
         <w:rPr>
-          <w:rFonts w:ascii="Cambria" w:hAnsi="Cambria" w:eastAsia="ＭＳ 明朝" w:cs="Cambria" w:asciiTheme="minorHAnsi" w:hAnsiTheme="minorHAnsi" w:eastAsiaTheme="minorEastAsia" w:csTheme="minorBidi"/>
-          <w:sz w:val="22"/>
-          <w:szCs w:val="22"/>
+          <w:b/>
+          <w:color w:val="CC0000"/>
         </w:rPr>
-        <w:t>線性組合: E[aX + bY] = aE[X] + bE[Y]；若獨立，Var(aX + bY) = a²Var(X) + b²Var(Y)</w:t>
-      </w:r>
-    </w:p>
-    <w:p>
-      <w:pPr>
-        <w:spacing w:after="200" w:line="276" w:lineRule="auto"/>
-      </w:pPr>
-      <w:r>
-        <w:rPr>
-          <w:rFonts w:ascii="Cambria" w:hAnsi="Cambria" w:eastAsia="ＭＳ 明朝" w:cs="Cambria" w:asciiTheme="minorHAnsi" w:hAnsiTheme="minorHAnsi" w:eastAsiaTheme="minorEastAsia" w:csTheme="minorBidi"/>
-          <w:b/>
-          <w:bCs/>
-          <w:color w:val="CC0000"/>
-          <w:sz w:val="22"/>
-          <w:szCs w:val="22"/>
-        </w:rPr>
-        <w:t>⚠️ 弱點提示 (隨時補充)：</w:t>
+        <w:t xml:space="preserve">⚠️ 陷阱: </w:t>
       </w:r>
       <w:r>
-        <w:rPr>
-          <w:rFonts w:ascii="Cambria" w:hAnsi="Cambria" w:eastAsia="ＭＳ 明朝" w:cs="Cambria" w:asciiTheme="minorHAnsi" w:hAnsiTheme="minorHAnsi" w:eastAsiaTheme="minorEastAsia" w:csTheme="minorBidi"/>
-          <w:sz w:val="22"/>
-          <w:szCs w:val="22"/>
-        </w:rPr>
-        <w:t xml:space="preserve"> 遇到多變數超幾何分配(Hypergeometric)，抽出不放回的機率：分母是總組合數 C(N, n)，分子是各項分別取出的組合數相乘。</w:t>
-      </w:r>
-    </w:p>
-    <w:p>
-      <w:pPr>
-        <w:pStyle w:val="Heading1"/>
-      </w:pPr>
-      <w:r>
-        <w:rPr>
-          <w:rFonts w:ascii="Calibri" w:hAnsi="Calibri" w:eastAsia="ＭＳ ゴシック" w:cs="Calibri" w:asciiTheme="majorHAnsi" w:hAnsiTheme="majorHAnsi" w:eastAsiaTheme="majorEastAsia" w:csTheme="majorBidi"/>
-          <w:b/>
-          <w:bCs/>
-          <w:color w:val="003366"/>
-          <w:sz w:val="28"/>
-          <w:szCs w:val="28"/>
-        </w:rPr>
-        <w:t>Ch 08 測量誤差 (Measurement Error)</w:t>
-      </w:r>
-    </w:p>
-    <w:p>
-      <w:pPr>
-        <w:pStyle w:val="ListBullet"/>
-        <w:ind w:left="360" w:hanging="360"/>
-      </w:pPr>
-      <w:r>
-        <w:rPr>
-          <w:rFonts w:ascii="Cambria" w:hAnsi="Cambria" w:eastAsia="ＭＳ 明朝" w:cs="Cambria" w:asciiTheme="minorHAnsi" w:hAnsiTheme="minorHAnsi" w:eastAsiaTheme="minorEastAsia" w:csTheme="minorBidi"/>
-          <w:sz w:val="22"/>
-          <w:szCs w:val="22"/>
-        </w:rPr>
-        <w:t>量測模型: Measured Value = True Value + Bias (系統誤差) + Random Error (隨機誤差)</w:t>
-      </w:r>
-    </w:p>
-    <w:p>
-      <w:pPr>
-        <w:pStyle w:val="ListBullet"/>
-        <w:ind w:left="360" w:hanging="360"/>
-      </w:pPr>
-      <w:r>
-        <w:rPr>
-          <w:rFonts w:ascii="Cambria" w:hAnsi="Cambria" w:eastAsia="ＭＳ 明朝" w:cs="Cambria" w:asciiTheme="minorHAnsi" w:hAnsiTheme="minorHAnsi" w:eastAsiaTheme="minorEastAsia" w:csTheme="minorBidi"/>
-          <w:sz w:val="22"/>
-          <w:szCs w:val="22"/>
-        </w:rPr>
-        <w:t>系統誤差 (Bias): 每次量測都固定的誤差 (例如體重計沒歸零，每次都少2公斤)。</w:t>
-      </w:r>
-    </w:p>
-    <w:p>
-      <w:pPr>
-        <w:pStyle w:val="ListBullet"/>
-        <w:ind w:left="360" w:hanging="360"/>
-      </w:pPr>
-      <w:r>
-        <w:rPr>
-          <w:rFonts w:ascii="Cambria" w:hAnsi="Cambria" w:eastAsia="ＭＳ 明朝" w:cs="Cambria" w:asciiTheme="minorHAnsi" w:hAnsiTheme="minorHAnsi" w:eastAsiaTheme="minorEastAsia" w:csTheme="minorBidi"/>
-          <w:sz w:val="22"/>
-          <w:szCs w:val="22"/>
-        </w:rPr>
-        <w:t>隨機誤差 (Random Error): 長期平均(期望值)會等於 0。</w:t>
-      </w:r>
-    </w:p>
-    <w:p>
-      <w:pPr>
-        <w:spacing w:after="200" w:line="276" w:lineRule="auto"/>
-      </w:pPr>
-      <w:r>
-        <w:rPr>
-          <w:rFonts w:ascii="Cambria" w:hAnsi="Cambria" w:eastAsia="ＭＳ 明朝" w:cs="Cambria" w:asciiTheme="minorHAnsi" w:hAnsiTheme="minorHAnsi" w:eastAsiaTheme="minorEastAsia" w:csTheme="minorBidi"/>
-          <w:b/>
-          <w:bCs/>
-          <w:color w:val="CC0000"/>
-          <w:sz w:val="22"/>
-          <w:szCs w:val="22"/>
-        </w:rPr>
-        <w:t>⚠️ 弱點提示 (隨時補充)：</w:t>
-      </w:r>
-      <w:r>
-        <w:rPr>
-          <w:rFonts w:ascii="Cambria" w:hAnsi="Cambria" w:eastAsia="ＭＳ 明朝" w:cs="Cambria" w:asciiTheme="minorHAnsi" w:hAnsiTheme="minorHAnsi" w:eastAsiaTheme="minorEastAsia" w:csTheme="minorBidi"/>
-          <w:sz w:val="22"/>
-          <w:szCs w:val="22"/>
-        </w:rPr>
-        <w:t xml:space="preserve"> 量測值的期望值 E[Measured] = True Value + Bias (因為 Random Error 的期望值是 0)。</w:t>
-      </w:r>
-    </w:p>
-    <w:p>
-      <w:pPr>
-        <w:pStyle w:val="Heading1"/>
-      </w:pPr>
-      <w:r>
-        <w:rPr>
-          <w:rFonts w:ascii="Calibri" w:hAnsi="Calibri" w:eastAsia="ＭＳ ゴシック" w:cs="Calibri" w:asciiTheme="majorHAnsi" w:hAnsiTheme="majorHAnsi" w:eastAsiaTheme="majorEastAsia" w:csTheme="majorBidi"/>
-          <w:b/>
-          <w:bCs/>
-          <w:color w:val="003366"/>
-          <w:sz w:val="28"/>
-          <w:szCs w:val="28"/>
-        </w:rPr>
-        <w:t>Ch 09 常態分配 (Normal Distribution)</w:t>
-      </w:r>
-    </w:p>
-    <w:p>
-      <w:pPr>
-        <w:pStyle w:val="ListBullet"/>
-        <w:ind w:left="360" w:hanging="360"/>
-      </w:pPr>
-      <w:r>
-        <w:rPr>
-          <w:rFonts w:ascii="Cambria" w:hAnsi="Cambria" w:eastAsia="ＭＳ 明朝" w:cs="Cambria" w:asciiTheme="minorHAnsi" w:hAnsiTheme="minorHAnsi" w:eastAsiaTheme="minorEastAsia" w:csTheme="minorBidi"/>
-          <w:sz w:val="22"/>
-          <w:szCs w:val="22"/>
-        </w:rPr>
-        <w:t>PDF為鐘型曲線(Bell Shape)，左右對稱於平均數 μ。</w:t>
-      </w:r>
-    </w:p>
-    <w:p>
-      <w:pPr>
-        <w:pStyle w:val="ListBullet"/>
-        <w:ind w:left="360" w:hanging="360"/>
-      </w:pPr>
-      <w:r>
-        <w:rPr>
-          <w:rFonts w:ascii="Cambria" w:hAnsi="Cambria" w:eastAsia="ＭＳ 明朝" w:cs="Cambria" w:asciiTheme="minorHAnsi" w:hAnsiTheme="minorHAnsi" w:eastAsiaTheme="minorEastAsia" w:csTheme="minorBidi"/>
-          <w:sz w:val="22"/>
-          <w:szCs w:val="22"/>
-        </w:rPr>
-        <w:t>68-95-99.7% 法則 (Empirical Rule):</w:t>
-      </w:r>
-    </w:p>
-    <w:p>
-      <w:pPr>
-        <w:pStyle w:val="ListBullet"/>
-        <w:ind w:left="360" w:hanging="360"/>
-      </w:pPr>
-      <w:r>
-        <w:rPr>
-          <w:rFonts w:ascii="Cambria" w:hAnsi="Cambria" w:eastAsia="ＭＳ 明朝" w:cs="Cambria" w:asciiTheme="minorHAnsi" w:hAnsiTheme="minorHAnsi" w:eastAsiaTheme="minorEastAsia" w:csTheme="minorBidi"/>
-          <w:sz w:val="22"/>
-          <w:szCs w:val="22"/>
-        </w:rPr>
-        <w:t xml:space="preserve">  - 落在 μ ± 1σ 之間的機率約為 68%</w:t>
-      </w:r>
-    </w:p>
-    <w:p>
-      <w:pPr>
-        <w:pStyle w:val="ListBullet"/>
-        <w:ind w:left="360" w:hanging="360"/>
-      </w:pPr>
-      <w:r>
-        <w:rPr>
-          <w:rFonts w:ascii="Cambria" w:hAnsi="Cambria" w:eastAsia="ＭＳ 明朝" w:cs="Cambria" w:asciiTheme="minorHAnsi" w:hAnsiTheme="minorHAnsi" w:eastAsiaTheme="minorEastAsia" w:csTheme="minorBidi"/>
-          <w:sz w:val="22"/>
-          <w:szCs w:val="22"/>
-        </w:rPr>
-        <w:t xml:space="preserve">  - 落在 μ ± 2σ 之間的機率約為 95%</w:t>
-      </w:r>
-    </w:p>
-    <w:p>
-      <w:pPr>
-        <w:pStyle w:val="ListBullet"/>
-        <w:ind w:left="360" w:hanging="360"/>
-      </w:pPr>
-      <w:r>
-        <w:rPr>
-          <w:rFonts w:ascii="Cambria" w:hAnsi="Cambria" w:eastAsia="ＭＳ 明朝" w:cs="Cambria" w:asciiTheme="minorHAnsi" w:hAnsiTheme="minorHAnsi" w:eastAsiaTheme="minorEastAsia" w:csTheme="minorBidi"/>
-          <w:sz w:val="22"/>
-          <w:szCs w:val="22"/>
-        </w:rPr>
-        <w:t xml:space="preserve">  - 落在 μ ± 3σ 之間的機率約為 99.7%</w:t>
-      </w:r>
-    </w:p>
-    <w:p>
-      <w:pPr>
-        <w:spacing w:after="200" w:line="276" w:lineRule="auto"/>
-      </w:pPr>
-      <w:r>
-        <w:rPr>
-          <w:rFonts w:ascii="Cambria" w:hAnsi="Cambria" w:eastAsia="ＭＳ 明朝" w:cs="Cambria" w:asciiTheme="minorHAnsi" w:hAnsiTheme="minorHAnsi" w:eastAsiaTheme="minorEastAsia" w:csTheme="minorBidi"/>
-          <w:b/>
-          <w:bCs/>
-          <w:color w:val="CC0000"/>
-          <w:sz w:val="22"/>
-          <w:szCs w:val="22"/>
-        </w:rPr>
-        <w:t>⚠️ 弱點提示 (隨時補充)：</w:t>
-      </w:r>
-      <w:r>
-        <w:rPr>
-          <w:rFonts w:ascii="Cambria" w:hAnsi="Cambria" w:eastAsia="ＭＳ 明朝" w:cs="Cambria" w:asciiTheme="minorHAnsi" w:hAnsiTheme="minorHAnsi" w:eastAsiaTheme="minorEastAsia" w:csTheme="minorBidi"/>
-          <w:sz w:val="22"/>
-          <w:szCs w:val="22"/>
-        </w:rPr>
-        <w:t xml:space="preserve"> 注意尾部機率陷阱！因為對稱，若要求「大於 μ + 2σ」的機率，算法是 (100% - 95%) / 2 = 2.5%。</w:t>
+        <w:t>連續校正 (Continuity Correction): 離散轉連續時，端點要 ±0.5 (例如求 P(X≤45) 要改算 P(X&lt;45.5))。</w:t>
       </w:r>
     </w:p>
     <w:sectPr>
       <w:pgSz w:w="12240" w:h="15840"/>
-      <w:pgMar w:top="720" w:right="720" w:bottom="720" w:left="720" w:header="720" w:footer="720" w:gutter="0"/>
+      <w:pgMar w:top="576" w:right="576" w:bottom="576" w:left="576" w:header="720" w:footer="720" w:gutter="0"/>
+      <w:cols w:space="720"/>
       <w:docGrid w:linePitch="360"/>
     </w:sectPr>
   </w:body>
@@ -1044,6 +656,13 @@
     <w:name w:val="Normal"/>
     <w:qFormat/>
     <w:rsid w:val="00FC693F"/>
+    <w:pPr>
+      <w:spacing w:after="40" w:before="0" w:line="240" w:lineRule="auto"/>
+    </w:pPr>
+    <w:rPr>
+      <w:rFonts w:ascii="Arial" w:hAnsi="Arial"/>
+      <w:sz w:val="20"/>
+    </w:rPr>
   </w:style>
   <w:style w:type="paragraph" w:styleId="Header">
     <w:name w:val="header"/>
@@ -1397,7 +1016,7 @@
       <w:color w:val="17365D" w:themeColor="text2" w:themeShade="BF"/>
       <w:spacing w:val="5"/>
       <w:kern w:val="28"/>
-      <w:sz w:val="52"/>
+      <w:sz w:val="28"/>
       <w:szCs w:val="52"/>
     </w:rPr>
   </w:style>

</xml_diff>